<commit_message>
Remove timeline and approval sections from the business requirements document
Removes sections 14 and 15 ("Timeline & Milestones" and "Approval & Sign-Off") from the `generate-brd.js` file, consequently updating the generated `brd.docx` and `brd.html` output files.

Replit-Commit-Author: Agent
Replit-Commit-Session-Id: 29602b81-b69f-4973-add0-51c64ce19664
Replit-Commit-Checkpoint-Type: full_checkpoint
Replit-Commit-Event-Id: 564f70ee-0b74-4657-b546-13c29863acb4
Replit-Commit-Screenshot-Url: https://storage.googleapis.com/screenshot-production-us-central1/5a8d4daf-493a-4520-a7a7-8fb2b0104d3a/29602b81-b69f-4973-add0-51c64ce19664/5T4g9XL
Replit-Helium-Checkpoint-Created: true
</commit_message>
<xml_diff>
--- a/prd-generator/output/brd.docx
+++ b/prd-generator/output/brd.docx
@@ -3705,12 +3705,12 @@
           <wp:inline distB="0" distL="0" distR="0" distT="0">
             <wp:extent cx="6502400" cy="3715657"/>
             <wp:effectExtent b="0" l="0" r="0" t="0"/>
-            <wp:docPr id="2" name="image-kDjvhEBBdruXSyiP6Tfyl.png"/>
+            <wp:docPr id="2" name="image-bK4T3tSMWenFJqbGT9BhG.png"/>
             <a:graphic>
               <a:graphicData uri="http://schemas.openxmlformats.org/drawingml/2006/picture">
                 <pic:pic>
                   <pic:nvPicPr>
-                    <pic:cNvPr id="2" name="image-kDjvhEBBdruXSyiP6Tfyl.png" descr="Screen flow diagram"/>
+                    <pic:cNvPr id="2" name="image-bK4T3tSMWenFJqbGT9BhG.png" descr="Screen flow diagram"/>
                     <pic:cNvPicPr/>
                   </pic:nvPicPr>
                   <pic:blipFill>
@@ -4576,12 +4576,12 @@
           <wp:inline distB="0" distL="0" distR="0" distT="0">
             <wp:extent cx="6502400" cy="2350153"/>
             <wp:effectExtent b="0" l="0" r="0" t="0"/>
-            <wp:docPr id="4" name="image-jXnv3PMMv0IrtAl3H-3kl.png"/>
+            <wp:docPr id="4" name="image-pHDhebd7FizqFV2AvZrAz.png"/>
             <a:graphic>
               <a:graphicData uri="http://schemas.openxmlformats.org/drawingml/2006/picture">
                 <pic:pic>
                   <pic:nvPicPr>
-                    <pic:cNvPr id="4" name="image-jXnv3PMMv0IrtAl3H-3kl.png" descr="Sales → Delivery (Opportunity to Project)"/>
+                    <pic:cNvPr id="4" name="image-pHDhebd7FizqFV2AvZrAz.png" descr="Sales → Delivery (Opportunity to Project)"/>
                     <pic:cNvPicPr/>
                   </pic:nvPicPr>
                   <pic:blipFill>
@@ -5323,12 +5323,12 @@
           <wp:inline distB="0" distL="0" distR="0" distT="0">
             <wp:extent cx="6502400" cy="2350153"/>
             <wp:effectExtent b="0" l="0" r="0" t="0"/>
-            <wp:docPr id="6" name="image-u9jARo5CHUOO_3TOUkv65.png"/>
+            <wp:docPr id="6" name="image-GZ1OSWAY2Mjnmj0vwauct.png"/>
             <a:graphic>
               <a:graphicData uri="http://schemas.openxmlformats.org/drawingml/2006/picture">
                 <pic:pic>
                   <pic:nvPicPr>
-                    <pic:cNvPr id="6" name="image-u9jARo5CHUOO_3TOUkv65.png" descr="Time → Approval → Invoice"/>
+                    <pic:cNvPr id="6" name="image-GZ1OSWAY2Mjnmj0vwauct.png" descr="Time → Approval → Invoice"/>
                     <pic:cNvPicPr/>
                   </pic:nvPicPr>
                   <pic:blipFill>
@@ -6070,12 +6070,12 @@
           <wp:inline distB="0" distL="0" distR="0" distT="0">
             <wp:extent cx="6502400" cy="1713847"/>
             <wp:effectExtent b="0" l="0" r="0" t="0"/>
-            <wp:docPr id="8" name="image-FtRwIpMa5r86JcR_hc1S4.png"/>
+            <wp:docPr id="8" name="image--1Jfg13mK1vu55dF89nQx.png"/>
             <a:graphic>
               <a:graphicData uri="http://schemas.openxmlformats.org/drawingml/2006/picture">
                 <pic:pic>
                   <pic:nvPicPr>
-                    <pic:cNvPr id="8" name="image-FtRwIpMa5r86JcR_hc1S4.png" descr="Resource Request → Allocation"/>
+                    <pic:cNvPr id="8" name="image--1Jfg13mK1vu55dF89nQx.png" descr="Resource Request → Allocation"/>
                     <pic:cNvPicPr/>
                   </pic:nvPicPr>
                   <pic:blipFill>
@@ -6736,12 +6736,12 @@
           <wp:inline distB="0" distL="0" distR="0" distT="0">
             <wp:extent cx="6502400" cy="1713847"/>
             <wp:effectExtent b="0" l="0" r="0" t="0"/>
-            <wp:docPr id="10" name="image-rY8cBFewjd8TKNCsj8EbB.png"/>
+            <wp:docPr id="10" name="image-aZSB1VXlIM5m3ASzQ9BKW.png"/>
             <a:graphic>
               <a:graphicData uri="http://schemas.openxmlformats.org/drawingml/2006/picture">
                 <pic:pic>
                   <pic:nvPicPr>
-                    <pic:cNvPr id="10" name="image-rY8cBFewjd8TKNCsj8EbB.png" descr="Milestone → Auto-Draft Invoice"/>
+                    <pic:cNvPr id="10" name="image-aZSB1VXlIM5m3ASzQ9BKW.png" descr="Milestone → Auto-Draft Invoice"/>
                     <pic:cNvPicPr/>
                   </pic:nvPicPr>
                   <pic:blipFill>
@@ -15750,2196 +15750,6 @@
             <w:r>
               <w:rPr/>
               <w:t xml:space="preserve">Quarterly steering, documented decisions, broad sponsor coalition</w:t>
-            </w:r>
-          </w:p>
-        </w:tc>
-      </w:tr>
-    </w:tbl>
-    <w:p>
-      <w:pPr>
-        <w:spacing w:lineRule="auto"/>
-      </w:pPr>
-      <w:r>
-        <w:rPr/>
-      </w:r>
-    </w:p>
-    <w:p>
-      <w:pPr>
-        <w:pStyle w:val="Heading2"/>
-        <w:spacing w:lineRule="auto"/>
-      </w:pPr>
-      <w:r>
-        <w:rPr/>
-        <w:t xml:space="preserve">14. Timeline &amp; Milestones</w:t>
-      </w:r>
-    </w:p>
-    <w:p>
-      <w:pPr>
-        <w:pStyle w:val="Heading3"/>
-        <w:spacing w:lineRule="auto"/>
-      </w:pPr>
-      <w:r>
-        <w:rPr/>
-        <w:t xml:space="preserve">14.1 High-Level Schedule</w:t>
-      </w:r>
-    </w:p>
-    <w:tbl>
-      <w:tblPr>
-        <w:tblBorders>
-          <w:top w:val="single" w:sz="2" w:space="0" w:color="000000"/>
-          <w:bottom w:val="single" w:sz="2" w:space="0" w:color="000000"/>
-          <w:left w:val="single" w:sz="2" w:space="0" w:color="000000"/>
-          <w:right w:val="single" w:sz="2" w:space="0" w:color="000000"/>
-        </w:tblBorders>
-        <w:tblCellSpacing w:w="0" w:type="dxa"/>
-        <w:tblCellMar>
-          <w:top w:type="dxa" w:w="80"/>
-          <w:bottom w:type="dxa" w:w="80"/>
-          <w:left w:type="dxa" w:w="160"/>
-          <w:right w:type="dxa" w:w="160"/>
-        </w:tblCellMar>
-        <w:jc w:val="center"/>
-      </w:tblPr>
-      <w:tblGrid>
-        <w:gridCol w:w="3413.3333333333335"/>
-        <w:gridCol w:w="3413.3333333333335"/>
-        <w:gridCol w:w="3413.3333333333335"/>
-      </w:tblGrid>
-      <w:tr>
-        <w:trPr>
-          <w:cantSplit/>
-        </w:trPr>
-        <w:tc>
-          <w:tcPr>
-            <w:tcBorders>
-              <w:top w:val="single" w:sz="1" w:space="0" w:color="000000"/>
-              <w:bottom w:val="single" w:sz="1" w:space="0" w:color="000000"/>
-              <w:left w:val="single" w:sz="1" w:space="0" w:color="000000"/>
-              <w:right w:val="single" w:sz="1" w:space="0" w:color="000000"/>
-            </w:tcBorders>
-          </w:tcPr>
-          <w:p>
-            <w:pPr>
-              <w:spacing w:lineRule="auto"/>
-            </w:pPr>
-            <w:r>
-              <w:rPr/>
-              <w:t xml:space="preserve">Phase</w:t>
-            </w:r>
-          </w:p>
-        </w:tc>
-        <w:tc>
-          <w:tcPr>
-            <w:tcBorders>
-              <w:top w:val="single" w:sz="1" w:space="0" w:color="000000"/>
-              <w:bottom w:val="single" w:sz="1" w:space="0" w:color="000000"/>
-              <w:left w:val="single" w:sz="1" w:space="0" w:color="000000"/>
-              <w:right w:val="single" w:sz="1" w:space="0" w:color="000000"/>
-            </w:tcBorders>
-          </w:tcPr>
-          <w:p>
-            <w:pPr>
-              <w:spacing w:lineRule="auto"/>
-            </w:pPr>
-            <w:r>
-              <w:rPr/>
-              <w:t xml:space="preserve">Window</w:t>
-            </w:r>
-          </w:p>
-        </w:tc>
-        <w:tc>
-          <w:tcPr>
-            <w:tcBorders>
-              <w:top w:val="single" w:sz="1" w:space="0" w:color="000000"/>
-              <w:bottom w:val="single" w:sz="1" w:space="0" w:color="000000"/>
-              <w:left w:val="single" w:sz="1" w:space="0" w:color="000000"/>
-              <w:right w:val="single" w:sz="1" w:space="0" w:color="000000"/>
-            </w:tcBorders>
-          </w:tcPr>
-          <w:p>
-            <w:pPr>
-              <w:spacing w:lineRule="auto"/>
-            </w:pPr>
-            <w:r>
-              <w:rPr/>
-              <w:t xml:space="preserve">Key Deliverable</w:t>
-            </w:r>
-          </w:p>
-        </w:tc>
-      </w:tr>
-      <w:tr>
-        <w:trPr>
-          <w:cantSplit/>
-        </w:trPr>
-        <w:tc>
-          <w:tcPr>
-            <w:tcBorders>
-              <w:top w:val="single" w:sz="1" w:space="0" w:color="000000"/>
-              <w:bottom w:val="single" w:sz="1" w:space="0" w:color="000000"/>
-              <w:left w:val="single" w:sz="1" w:space="0" w:color="000000"/>
-              <w:right w:val="single" w:sz="1" w:space="0" w:color="000000"/>
-            </w:tcBorders>
-          </w:tcPr>
-          <w:p>
-            <w:pPr>
-              <w:spacing w:lineRule="auto"/>
-            </w:pPr>
-            <w:r>
-              <w:rPr/>
-              <w:t xml:space="preserve">Discovery &amp; Mobilisation</w:t>
-            </w:r>
-          </w:p>
-        </w:tc>
-        <w:tc>
-          <w:tcPr>
-            <w:tcBorders>
-              <w:top w:val="single" w:sz="1" w:space="0" w:color="000000"/>
-              <w:bottom w:val="single" w:sz="1" w:space="0" w:color="000000"/>
-              <w:left w:val="single" w:sz="1" w:space="0" w:color="000000"/>
-              <w:right w:val="single" w:sz="1" w:space="0" w:color="000000"/>
-            </w:tcBorders>
-          </w:tcPr>
-          <w:p>
-            <w:pPr>
-              <w:spacing w:lineRule="auto"/>
-            </w:pPr>
-            <w:r>
-              <w:rPr/>
-              <w:t xml:space="preserve">Weeks 1–4</w:t>
-            </w:r>
-          </w:p>
-        </w:tc>
-        <w:tc>
-          <w:tcPr>
-            <w:tcBorders>
-              <w:top w:val="single" w:sz="1" w:space="0" w:color="000000"/>
-              <w:bottom w:val="single" w:sz="1" w:space="0" w:color="000000"/>
-              <w:left w:val="single" w:sz="1" w:space="0" w:color="000000"/>
-              <w:right w:val="single" w:sz="1" w:space="0" w:color="000000"/>
-            </w:tcBorders>
-          </w:tcPr>
-          <w:p>
-            <w:pPr>
-              <w:spacing w:lineRule="auto"/>
-            </w:pPr>
-            <w:r>
-              <w:rPr/>
-              <w:t xml:space="preserve">Signed BRD, governance, env access</w:t>
-            </w:r>
-          </w:p>
-        </w:tc>
-      </w:tr>
-      <w:tr>
-        <w:trPr>
-          <w:cantSplit/>
-        </w:trPr>
-        <w:tc>
-          <w:tcPr>
-            <w:tcBorders>
-              <w:top w:val="single" w:sz="1" w:space="0" w:color="000000"/>
-              <w:bottom w:val="single" w:sz="1" w:space="0" w:color="000000"/>
-              <w:left w:val="single" w:sz="1" w:space="0" w:color="000000"/>
-              <w:right w:val="single" w:sz="1" w:space="0" w:color="000000"/>
-            </w:tcBorders>
-          </w:tcPr>
-          <w:p>
-            <w:pPr>
-              <w:spacing w:lineRule="auto"/>
-            </w:pPr>
-            <w:r>
-              <w:rPr/>
-              <w:t xml:space="preserve">Design</w:t>
-            </w:r>
-          </w:p>
-        </w:tc>
-        <w:tc>
-          <w:tcPr>
-            <w:tcBorders>
-              <w:top w:val="single" w:sz="1" w:space="0" w:color="000000"/>
-              <w:bottom w:val="single" w:sz="1" w:space="0" w:color="000000"/>
-              <w:left w:val="single" w:sz="1" w:space="0" w:color="000000"/>
-              <w:right w:val="single" w:sz="1" w:space="0" w:color="000000"/>
-            </w:tcBorders>
-          </w:tcPr>
-          <w:p>
-            <w:pPr>
-              <w:spacing w:lineRule="auto"/>
-            </w:pPr>
-            <w:r>
-              <w:rPr/>
-              <w:t xml:space="preserve">Weeks 5–10</w:t>
-            </w:r>
-          </w:p>
-        </w:tc>
-        <w:tc>
-          <w:tcPr>
-            <w:tcBorders>
-              <w:top w:val="single" w:sz="1" w:space="0" w:color="000000"/>
-              <w:bottom w:val="single" w:sz="1" w:space="0" w:color="000000"/>
-              <w:left w:val="single" w:sz="1" w:space="0" w:color="000000"/>
-              <w:right w:val="single" w:sz="1" w:space="0" w:color="000000"/>
-            </w:tcBorders>
-          </w:tcPr>
-          <w:p>
-            <w:pPr>
-              <w:spacing w:lineRule="auto"/>
-            </w:pPr>
-            <w:r>
-              <w:rPr/>
-              <w:t xml:space="preserve">Solution design, migration plan, integration design</w:t>
-            </w:r>
-          </w:p>
-        </w:tc>
-      </w:tr>
-      <w:tr>
-        <w:trPr>
-          <w:cantSplit/>
-        </w:trPr>
-        <w:tc>
-          <w:tcPr>
-            <w:tcBorders>
-              <w:top w:val="single" w:sz="1" w:space="0" w:color="000000"/>
-              <w:bottom w:val="single" w:sz="1" w:space="0" w:color="000000"/>
-              <w:left w:val="single" w:sz="1" w:space="0" w:color="000000"/>
-              <w:right w:val="single" w:sz="1" w:space="0" w:color="000000"/>
-            </w:tcBorders>
-          </w:tcPr>
-          <w:p>
-            <w:pPr>
-              <w:spacing w:lineRule="auto"/>
-            </w:pPr>
-            <w:r>
-              <w:rPr/>
-              <w:t xml:space="preserve">Build — Sprint 1 (CRM + Projects)</w:t>
-            </w:r>
-          </w:p>
-        </w:tc>
-        <w:tc>
-          <w:tcPr>
-            <w:tcBorders>
-              <w:top w:val="single" w:sz="1" w:space="0" w:color="000000"/>
-              <w:bottom w:val="single" w:sz="1" w:space="0" w:color="000000"/>
-              <w:left w:val="single" w:sz="1" w:space="0" w:color="000000"/>
-              <w:right w:val="single" w:sz="1" w:space="0" w:color="000000"/>
-            </w:tcBorders>
-          </w:tcPr>
-          <w:p>
-            <w:pPr>
-              <w:spacing w:lineRule="auto"/>
-            </w:pPr>
-            <w:r>
-              <w:rPr/>
-              <w:t xml:space="preserve">Weeks 11–14</w:t>
-            </w:r>
-          </w:p>
-        </w:tc>
-        <w:tc>
-          <w:tcPr>
-            <w:tcBorders>
-              <w:top w:val="single" w:sz="1" w:space="0" w:color="000000"/>
-              <w:bottom w:val="single" w:sz="1" w:space="0" w:color="000000"/>
-              <w:left w:val="single" w:sz="1" w:space="0" w:color="000000"/>
-              <w:right w:val="single" w:sz="1" w:space="0" w:color="000000"/>
-            </w:tcBorders>
-          </w:tcPr>
-          <w:p>
-            <w:pPr>
-              <w:spacing w:lineRule="auto"/>
-            </w:pPr>
-            <w:r>
-              <w:rPr/>
-              <w:t xml:space="preserve">CRM and Projects modules feature-complete</w:t>
-            </w:r>
-          </w:p>
-        </w:tc>
-      </w:tr>
-      <w:tr>
-        <w:trPr>
-          <w:cantSplit/>
-        </w:trPr>
-        <w:tc>
-          <w:tcPr>
-            <w:tcBorders>
-              <w:top w:val="single" w:sz="1" w:space="0" w:color="000000"/>
-              <w:bottom w:val="single" w:sz="1" w:space="0" w:color="000000"/>
-              <w:left w:val="single" w:sz="1" w:space="0" w:color="000000"/>
-              <w:right w:val="single" w:sz="1" w:space="0" w:color="000000"/>
-            </w:tcBorders>
-          </w:tcPr>
-          <w:p>
-            <w:pPr>
-              <w:spacing w:lineRule="auto"/>
-            </w:pPr>
-            <w:r>
-              <w:rPr/>
-              <w:t xml:space="preserve">Build — Sprint 2 (Resources + Time)</w:t>
-            </w:r>
-          </w:p>
-        </w:tc>
-        <w:tc>
-          <w:tcPr>
-            <w:tcBorders>
-              <w:top w:val="single" w:sz="1" w:space="0" w:color="000000"/>
-              <w:bottom w:val="single" w:sz="1" w:space="0" w:color="000000"/>
-              <w:left w:val="single" w:sz="1" w:space="0" w:color="000000"/>
-              <w:right w:val="single" w:sz="1" w:space="0" w:color="000000"/>
-            </w:tcBorders>
-          </w:tcPr>
-          <w:p>
-            <w:pPr>
-              <w:spacing w:lineRule="auto"/>
-            </w:pPr>
-            <w:r>
-              <w:rPr/>
-              <w:t xml:space="preserve">Weeks 15–18</w:t>
-            </w:r>
-          </w:p>
-        </w:tc>
-        <w:tc>
-          <w:tcPr>
-            <w:tcBorders>
-              <w:top w:val="single" w:sz="1" w:space="0" w:color="000000"/>
-              <w:bottom w:val="single" w:sz="1" w:space="0" w:color="000000"/>
-              <w:left w:val="single" w:sz="1" w:space="0" w:color="000000"/>
-              <w:right w:val="single" w:sz="1" w:space="0" w:color="000000"/>
-            </w:tcBorders>
-          </w:tcPr>
-          <w:p>
-            <w:pPr>
-              <w:spacing w:lineRule="auto"/>
-            </w:pPr>
-            <w:r>
-              <w:rPr/>
-              <w:t xml:space="preserve">Resources and Time modules feature-complete</w:t>
-            </w:r>
-          </w:p>
-        </w:tc>
-      </w:tr>
-      <w:tr>
-        <w:trPr>
-          <w:cantSplit/>
-        </w:trPr>
-        <w:tc>
-          <w:tcPr>
-            <w:tcBorders>
-              <w:top w:val="single" w:sz="1" w:space="0" w:color="000000"/>
-              <w:bottom w:val="single" w:sz="1" w:space="0" w:color="000000"/>
-              <w:left w:val="single" w:sz="1" w:space="0" w:color="000000"/>
-              <w:right w:val="single" w:sz="1" w:space="0" w:color="000000"/>
-            </w:tcBorders>
-          </w:tcPr>
-          <w:p>
-            <w:pPr>
-              <w:spacing w:lineRule="auto"/>
-            </w:pPr>
-            <w:r>
-              <w:rPr/>
-              <w:t xml:space="preserve">Build — Sprint 3 (Finance + Reports)</w:t>
-            </w:r>
-          </w:p>
-        </w:tc>
-        <w:tc>
-          <w:tcPr>
-            <w:tcBorders>
-              <w:top w:val="single" w:sz="1" w:space="0" w:color="000000"/>
-              <w:bottom w:val="single" w:sz="1" w:space="0" w:color="000000"/>
-              <w:left w:val="single" w:sz="1" w:space="0" w:color="000000"/>
-              <w:right w:val="single" w:sz="1" w:space="0" w:color="000000"/>
-            </w:tcBorders>
-          </w:tcPr>
-          <w:p>
-            <w:pPr>
-              <w:spacing w:lineRule="auto"/>
-            </w:pPr>
-            <w:r>
-              <w:rPr/>
-              <w:t xml:space="preserve">Weeks 19–22</w:t>
-            </w:r>
-          </w:p>
-        </w:tc>
-        <w:tc>
-          <w:tcPr>
-            <w:tcBorders>
-              <w:top w:val="single" w:sz="1" w:space="0" w:color="000000"/>
-              <w:bottom w:val="single" w:sz="1" w:space="0" w:color="000000"/>
-              <w:left w:val="single" w:sz="1" w:space="0" w:color="000000"/>
-              <w:right w:val="single" w:sz="1" w:space="0" w:color="000000"/>
-            </w:tcBorders>
-          </w:tcPr>
-          <w:p>
-            <w:pPr>
-              <w:spacing w:lineRule="auto"/>
-            </w:pPr>
-            <w:r>
-              <w:rPr/>
-              <w:t xml:space="preserve">Finance, Reporting, NetSuite integration</w:t>
-            </w:r>
-          </w:p>
-        </w:tc>
-      </w:tr>
-      <w:tr>
-        <w:trPr>
-          <w:cantSplit/>
-        </w:trPr>
-        <w:tc>
-          <w:tcPr>
-            <w:tcBorders>
-              <w:top w:val="single" w:sz="1" w:space="0" w:color="000000"/>
-              <w:bottom w:val="single" w:sz="1" w:space="0" w:color="000000"/>
-              <w:left w:val="single" w:sz="1" w:space="0" w:color="000000"/>
-              <w:right w:val="single" w:sz="1" w:space="0" w:color="000000"/>
-            </w:tcBorders>
-          </w:tcPr>
-          <w:p>
-            <w:pPr>
-              <w:spacing w:lineRule="auto"/>
-            </w:pPr>
-            <w:r>
-              <w:rPr/>
-              <w:t xml:space="preserve">Build — Sprint 4 (Admin + Polish)</w:t>
-            </w:r>
-          </w:p>
-        </w:tc>
-        <w:tc>
-          <w:tcPr>
-            <w:tcBorders>
-              <w:top w:val="single" w:sz="1" w:space="0" w:color="000000"/>
-              <w:bottom w:val="single" w:sz="1" w:space="0" w:color="000000"/>
-              <w:left w:val="single" w:sz="1" w:space="0" w:color="000000"/>
-              <w:right w:val="single" w:sz="1" w:space="0" w:color="000000"/>
-            </w:tcBorders>
-          </w:tcPr>
-          <w:p>
-            <w:pPr>
-              <w:spacing w:lineRule="auto"/>
-            </w:pPr>
-            <w:r>
-              <w:rPr/>
-              <w:t xml:space="preserve">Weeks 23–25</w:t>
-            </w:r>
-          </w:p>
-        </w:tc>
-        <w:tc>
-          <w:tcPr>
-            <w:tcBorders>
-              <w:top w:val="single" w:sz="1" w:space="0" w:color="000000"/>
-              <w:bottom w:val="single" w:sz="1" w:space="0" w:color="000000"/>
-              <w:left w:val="single" w:sz="1" w:space="0" w:color="000000"/>
-              <w:right w:val="single" w:sz="1" w:space="0" w:color="000000"/>
-            </w:tcBorders>
-          </w:tcPr>
-          <w:p>
-            <w:pPr>
-              <w:spacing w:lineRule="auto"/>
-            </w:pPr>
-            <w:r>
-              <w:rPr/>
-              <w:t xml:space="preserve">RBAC, audit, custom fields, templates</w:t>
-            </w:r>
-          </w:p>
-        </w:tc>
-      </w:tr>
-      <w:tr>
-        <w:trPr>
-          <w:cantSplit/>
-        </w:trPr>
-        <w:tc>
-          <w:tcPr>
-            <w:tcBorders>
-              <w:top w:val="single" w:sz="1" w:space="0" w:color="000000"/>
-              <w:bottom w:val="single" w:sz="1" w:space="0" w:color="000000"/>
-              <w:left w:val="single" w:sz="1" w:space="0" w:color="000000"/>
-              <w:right w:val="single" w:sz="1" w:space="0" w:color="000000"/>
-            </w:tcBorders>
-          </w:tcPr>
-          <w:p>
-            <w:pPr>
-              <w:spacing w:lineRule="auto"/>
-            </w:pPr>
-            <w:r>
-              <w:rPr/>
-              <w:t xml:space="preserve">System Integration Test (SIT)</w:t>
-            </w:r>
-          </w:p>
-        </w:tc>
-        <w:tc>
-          <w:tcPr>
-            <w:tcBorders>
-              <w:top w:val="single" w:sz="1" w:space="0" w:color="000000"/>
-              <w:bottom w:val="single" w:sz="1" w:space="0" w:color="000000"/>
-              <w:left w:val="single" w:sz="1" w:space="0" w:color="000000"/>
-              <w:right w:val="single" w:sz="1" w:space="0" w:color="000000"/>
-            </w:tcBorders>
-          </w:tcPr>
-          <w:p>
-            <w:pPr>
-              <w:spacing w:lineRule="auto"/>
-            </w:pPr>
-            <w:r>
-              <w:rPr/>
-              <w:t xml:space="preserve">Weeks 26–28</w:t>
-            </w:r>
-          </w:p>
-        </w:tc>
-        <w:tc>
-          <w:tcPr>
-            <w:tcBorders>
-              <w:top w:val="single" w:sz="1" w:space="0" w:color="000000"/>
-              <w:bottom w:val="single" w:sz="1" w:space="0" w:color="000000"/>
-              <w:left w:val="single" w:sz="1" w:space="0" w:color="000000"/>
-              <w:right w:val="single" w:sz="1" w:space="0" w:color="000000"/>
-            </w:tcBorders>
-          </w:tcPr>
-          <w:p>
-            <w:pPr>
-              <w:spacing w:lineRule="auto"/>
-            </w:pPr>
-            <w:r>
-              <w:rPr/>
-              <w:t xml:space="preserve">All defects ≤ Sev-2 closed</w:t>
-            </w:r>
-          </w:p>
-        </w:tc>
-      </w:tr>
-      <w:tr>
-        <w:trPr>
-          <w:cantSplit/>
-        </w:trPr>
-        <w:tc>
-          <w:tcPr>
-            <w:tcBorders>
-              <w:top w:val="single" w:sz="1" w:space="0" w:color="000000"/>
-              <w:bottom w:val="single" w:sz="1" w:space="0" w:color="000000"/>
-              <w:left w:val="single" w:sz="1" w:space="0" w:color="000000"/>
-              <w:right w:val="single" w:sz="1" w:space="0" w:color="000000"/>
-            </w:tcBorders>
-          </w:tcPr>
-          <w:p>
-            <w:pPr>
-              <w:spacing w:lineRule="auto"/>
-            </w:pPr>
-            <w:r>
-              <w:rPr/>
-              <w:t xml:space="preserve">User Acceptance Test (UAT)</w:t>
-            </w:r>
-          </w:p>
-        </w:tc>
-        <w:tc>
-          <w:tcPr>
-            <w:tcBorders>
-              <w:top w:val="single" w:sz="1" w:space="0" w:color="000000"/>
-              <w:bottom w:val="single" w:sz="1" w:space="0" w:color="000000"/>
-              <w:left w:val="single" w:sz="1" w:space="0" w:color="000000"/>
-              <w:right w:val="single" w:sz="1" w:space="0" w:color="000000"/>
-            </w:tcBorders>
-          </w:tcPr>
-          <w:p>
-            <w:pPr>
-              <w:spacing w:lineRule="auto"/>
-            </w:pPr>
-            <w:r>
-              <w:rPr/>
-              <w:t xml:space="preserve">Weeks 29–31</w:t>
-            </w:r>
-          </w:p>
-        </w:tc>
-        <w:tc>
-          <w:tcPr>
-            <w:tcBorders>
-              <w:top w:val="single" w:sz="1" w:space="0" w:color="000000"/>
-              <w:bottom w:val="single" w:sz="1" w:space="0" w:color="000000"/>
-              <w:left w:val="single" w:sz="1" w:space="0" w:color="000000"/>
-              <w:right w:val="single" w:sz="1" w:space="0" w:color="000000"/>
-            </w:tcBorders>
-          </w:tcPr>
-          <w:p>
-            <w:pPr>
-              <w:spacing w:lineRule="auto"/>
-            </w:pPr>
-            <w:r>
-              <w:rPr/>
-              <w:t xml:space="preserve">UAT sign-off by business owners</w:t>
-            </w:r>
-          </w:p>
-        </w:tc>
-      </w:tr>
-      <w:tr>
-        <w:trPr>
-          <w:cantSplit/>
-        </w:trPr>
-        <w:tc>
-          <w:tcPr>
-            <w:tcBorders>
-              <w:top w:val="single" w:sz="1" w:space="0" w:color="000000"/>
-              <w:bottom w:val="single" w:sz="1" w:space="0" w:color="000000"/>
-              <w:left w:val="single" w:sz="1" w:space="0" w:color="000000"/>
-              <w:right w:val="single" w:sz="1" w:space="0" w:color="000000"/>
-            </w:tcBorders>
-          </w:tcPr>
-          <w:p>
-            <w:pPr>
-              <w:spacing w:lineRule="auto"/>
-            </w:pPr>
-            <w:r>
-              <w:rPr/>
-              <w:t xml:space="preserve">Data Migration &amp; Cutover</w:t>
-            </w:r>
-          </w:p>
-        </w:tc>
-        <w:tc>
-          <w:tcPr>
-            <w:tcBorders>
-              <w:top w:val="single" w:sz="1" w:space="0" w:color="000000"/>
-              <w:bottom w:val="single" w:sz="1" w:space="0" w:color="000000"/>
-              <w:left w:val="single" w:sz="1" w:space="0" w:color="000000"/>
-              <w:right w:val="single" w:sz="1" w:space="0" w:color="000000"/>
-            </w:tcBorders>
-          </w:tcPr>
-          <w:p>
-            <w:pPr>
-              <w:spacing w:lineRule="auto"/>
-            </w:pPr>
-            <w:r>
-              <w:rPr/>
-              <w:t xml:space="preserve">Weeks 32–33</w:t>
-            </w:r>
-          </w:p>
-        </w:tc>
-        <w:tc>
-          <w:tcPr>
-            <w:tcBorders>
-              <w:top w:val="single" w:sz="1" w:space="0" w:color="000000"/>
-              <w:bottom w:val="single" w:sz="1" w:space="0" w:color="000000"/>
-              <w:left w:val="single" w:sz="1" w:space="0" w:color="000000"/>
-              <w:right w:val="single" w:sz="1" w:space="0" w:color="000000"/>
-            </w:tcBorders>
-          </w:tcPr>
-          <w:p>
-            <w:pPr>
-              <w:spacing w:lineRule="auto"/>
-            </w:pPr>
-            <w:r>
-              <w:rPr/>
-              <w:t xml:space="preserve">Production data loaded &amp; reconciled</w:t>
-            </w:r>
-          </w:p>
-        </w:tc>
-      </w:tr>
-      <w:tr>
-        <w:trPr>
-          <w:cantSplit/>
-        </w:trPr>
-        <w:tc>
-          <w:tcPr>
-            <w:tcBorders>
-              <w:top w:val="single" w:sz="1" w:space="0" w:color="000000"/>
-              <w:bottom w:val="single" w:sz="1" w:space="0" w:color="000000"/>
-              <w:left w:val="single" w:sz="1" w:space="0" w:color="000000"/>
-              <w:right w:val="single" w:sz="1" w:space="0" w:color="000000"/>
-            </w:tcBorders>
-          </w:tcPr>
-          <w:p>
-            <w:pPr>
-              <w:spacing w:lineRule="auto"/>
-            </w:pPr>
-            <w:r>
-              <w:rPr/>
-              <w:t xml:space="preserve">Pilot Go-Live (1 region)</w:t>
-            </w:r>
-          </w:p>
-        </w:tc>
-        <w:tc>
-          <w:tcPr>
-            <w:tcBorders>
-              <w:top w:val="single" w:sz="1" w:space="0" w:color="000000"/>
-              <w:bottom w:val="single" w:sz="1" w:space="0" w:color="000000"/>
-              <w:left w:val="single" w:sz="1" w:space="0" w:color="000000"/>
-              <w:right w:val="single" w:sz="1" w:space="0" w:color="000000"/>
-            </w:tcBorders>
-          </w:tcPr>
-          <w:p>
-            <w:pPr>
-              <w:spacing w:lineRule="auto"/>
-            </w:pPr>
-            <w:r>
-              <w:rPr/>
-              <w:t xml:space="preserve">Week 34</w:t>
-            </w:r>
-          </w:p>
-        </w:tc>
-        <w:tc>
-          <w:tcPr>
-            <w:tcBorders>
-              <w:top w:val="single" w:sz="1" w:space="0" w:color="000000"/>
-              <w:bottom w:val="single" w:sz="1" w:space="0" w:color="000000"/>
-              <w:left w:val="single" w:sz="1" w:space="0" w:color="000000"/>
-              <w:right w:val="single" w:sz="1" w:space="0" w:color="000000"/>
-            </w:tcBorders>
-          </w:tcPr>
-          <w:p>
-            <w:pPr>
-              <w:spacing w:lineRule="auto"/>
-            </w:pPr>
-            <w:r>
-              <w:rPr/>
-              <w:t xml:space="preserve">~50 users live, hypercare</w:t>
-            </w:r>
-          </w:p>
-        </w:tc>
-      </w:tr>
-      <w:tr>
-        <w:trPr>
-          <w:cantSplit/>
-        </w:trPr>
-        <w:tc>
-          <w:tcPr>
-            <w:tcBorders>
-              <w:top w:val="single" w:sz="1" w:space="0" w:color="000000"/>
-              <w:bottom w:val="single" w:sz="1" w:space="0" w:color="000000"/>
-              <w:left w:val="single" w:sz="1" w:space="0" w:color="000000"/>
-              <w:right w:val="single" w:sz="1" w:space="0" w:color="000000"/>
-            </w:tcBorders>
-          </w:tcPr>
-          <w:p>
-            <w:pPr>
-              <w:spacing w:lineRule="auto"/>
-            </w:pPr>
-            <w:r>
-              <w:rPr/>
-              <w:t xml:space="preserve">Phased Rollout</w:t>
-            </w:r>
-          </w:p>
-        </w:tc>
-        <w:tc>
-          <w:tcPr>
-            <w:tcBorders>
-              <w:top w:val="single" w:sz="1" w:space="0" w:color="000000"/>
-              <w:bottom w:val="single" w:sz="1" w:space="0" w:color="000000"/>
-              <w:left w:val="single" w:sz="1" w:space="0" w:color="000000"/>
-              <w:right w:val="single" w:sz="1" w:space="0" w:color="000000"/>
-            </w:tcBorders>
-          </w:tcPr>
-          <w:p>
-            <w:pPr>
-              <w:spacing w:lineRule="auto"/>
-            </w:pPr>
-            <w:r>
-              <w:rPr/>
-              <w:t xml:space="preserve">Weeks 35–40</w:t>
-            </w:r>
-          </w:p>
-        </w:tc>
-        <w:tc>
-          <w:tcPr>
-            <w:tcBorders>
-              <w:top w:val="single" w:sz="1" w:space="0" w:color="000000"/>
-              <w:bottom w:val="single" w:sz="1" w:space="0" w:color="000000"/>
-              <w:left w:val="single" w:sz="1" w:space="0" w:color="000000"/>
-              <w:right w:val="single" w:sz="1" w:space="0" w:color="000000"/>
-            </w:tcBorders>
-          </w:tcPr>
-          <w:p>
-            <w:pPr>
-              <w:spacing w:lineRule="auto"/>
-            </w:pPr>
-            <w:r>
-              <w:rPr/>
-              <w:t xml:space="preserve">Full firm live</w:t>
-            </w:r>
-          </w:p>
-        </w:tc>
-      </w:tr>
-      <w:tr>
-        <w:trPr>
-          <w:cantSplit/>
-        </w:trPr>
-        <w:tc>
-          <w:tcPr>
-            <w:tcBorders>
-              <w:top w:val="single" w:sz="1" w:space="0" w:color="000000"/>
-              <w:bottom w:val="single" w:sz="1" w:space="0" w:color="000000"/>
-              <w:left w:val="single" w:sz="1" w:space="0" w:color="000000"/>
-              <w:right w:val="single" w:sz="1" w:space="0" w:color="000000"/>
-            </w:tcBorders>
-          </w:tcPr>
-          <w:p>
-            <w:pPr>
-              <w:spacing w:lineRule="auto"/>
-            </w:pPr>
-            <w:r>
-              <w:rPr/>
-              <w:t xml:space="preserve">Post Go-Live Hypercare</w:t>
-            </w:r>
-          </w:p>
-        </w:tc>
-        <w:tc>
-          <w:tcPr>
-            <w:tcBorders>
-              <w:top w:val="single" w:sz="1" w:space="0" w:color="000000"/>
-              <w:bottom w:val="single" w:sz="1" w:space="0" w:color="000000"/>
-              <w:left w:val="single" w:sz="1" w:space="0" w:color="000000"/>
-              <w:right w:val="single" w:sz="1" w:space="0" w:color="000000"/>
-            </w:tcBorders>
-          </w:tcPr>
-          <w:p>
-            <w:pPr>
-              <w:spacing w:lineRule="auto"/>
-            </w:pPr>
-            <w:r>
-              <w:rPr/>
-              <w:t xml:space="preserve">Weeks 41–48</w:t>
-            </w:r>
-          </w:p>
-        </w:tc>
-        <w:tc>
-          <w:tcPr>
-            <w:tcBorders>
-              <w:top w:val="single" w:sz="1" w:space="0" w:color="000000"/>
-              <w:bottom w:val="single" w:sz="1" w:space="0" w:color="000000"/>
-              <w:left w:val="single" w:sz="1" w:space="0" w:color="000000"/>
-              <w:right w:val="single" w:sz="1" w:space="0" w:color="000000"/>
-            </w:tcBorders>
-          </w:tcPr>
-          <w:p>
-            <w:pPr>
-              <w:spacing w:lineRule="auto"/>
-            </w:pPr>
-            <w:r>
-              <w:rPr/>
-              <w:t xml:space="preserve">≤ 5 critical defects, KPI tracking starts</w:t>
-            </w:r>
-          </w:p>
-        </w:tc>
-      </w:tr>
-    </w:tbl>
-    <w:p>
-      <w:pPr>
-        <w:spacing w:lineRule="auto"/>
-      </w:pPr>
-      <w:r>
-        <w:rPr/>
-      </w:r>
-    </w:p>
-    <w:p>
-      <w:pPr>
-        <w:pStyle w:val="Heading3"/>
-        <w:spacing w:lineRule="auto"/>
-      </w:pPr>
-      <w:r>
-        <w:rPr/>
-        <w:t xml:space="preserve">14.2 Key Milestones</w:t>
-      </w:r>
-    </w:p>
-    <w:tbl>
-      <w:tblPr>
-        <w:tblBorders>
-          <w:top w:val="single" w:sz="2" w:space="0" w:color="000000"/>
-          <w:bottom w:val="single" w:sz="2" w:space="0" w:color="000000"/>
-          <w:left w:val="single" w:sz="2" w:space="0" w:color="000000"/>
-          <w:right w:val="single" w:sz="2" w:space="0" w:color="000000"/>
-        </w:tblBorders>
-        <w:tblCellSpacing w:w="0" w:type="dxa"/>
-        <w:tblCellMar>
-          <w:top w:type="dxa" w:w="80"/>
-          <w:bottom w:type="dxa" w:w="80"/>
-          <w:left w:type="dxa" w:w="160"/>
-          <w:right w:type="dxa" w:w="160"/>
-        </w:tblCellMar>
-        <w:jc w:val="center"/>
-      </w:tblPr>
-      <w:tblGrid>
-        <w:gridCol w:w="2560"/>
-        <w:gridCol w:w="2560"/>
-        <w:gridCol w:w="2560"/>
-        <w:gridCol w:w="2560"/>
-      </w:tblGrid>
-      <w:tr>
-        <w:trPr>
-          <w:cantSplit/>
-        </w:trPr>
-        <w:tc>
-          <w:tcPr>
-            <w:tcBorders>
-              <w:top w:val="single" w:sz="1" w:space="0" w:color="000000"/>
-              <w:bottom w:val="single" w:sz="1" w:space="0" w:color="000000"/>
-              <w:left w:val="single" w:sz="1" w:space="0" w:color="000000"/>
-              <w:right w:val="single" w:sz="1" w:space="0" w:color="000000"/>
-            </w:tcBorders>
-          </w:tcPr>
-          <w:p>
-            <w:pPr>
-              <w:spacing w:lineRule="auto"/>
-            </w:pPr>
-            <w:r>
-              <w:rPr/>
-              <w:t xml:space="preserve">#</w:t>
-            </w:r>
-          </w:p>
-        </w:tc>
-        <w:tc>
-          <w:tcPr>
-            <w:tcBorders>
-              <w:top w:val="single" w:sz="1" w:space="0" w:color="000000"/>
-              <w:bottom w:val="single" w:sz="1" w:space="0" w:color="000000"/>
-              <w:left w:val="single" w:sz="1" w:space="0" w:color="000000"/>
-              <w:right w:val="single" w:sz="1" w:space="0" w:color="000000"/>
-            </w:tcBorders>
-          </w:tcPr>
-          <w:p>
-            <w:pPr>
-              <w:spacing w:lineRule="auto"/>
-            </w:pPr>
-            <w:r>
-              <w:rPr/>
-              <w:t xml:space="preserve">Milestone</w:t>
-            </w:r>
-          </w:p>
-        </w:tc>
-        <w:tc>
-          <w:tcPr>
-            <w:tcBorders>
-              <w:top w:val="single" w:sz="1" w:space="0" w:color="000000"/>
-              <w:bottom w:val="single" w:sz="1" w:space="0" w:color="000000"/>
-              <w:left w:val="single" w:sz="1" w:space="0" w:color="000000"/>
-              <w:right w:val="single" w:sz="1" w:space="0" w:color="000000"/>
-            </w:tcBorders>
-          </w:tcPr>
-          <w:p>
-            <w:pPr>
-              <w:spacing w:lineRule="auto"/>
-            </w:pPr>
-            <w:r>
-              <w:rPr/>
-              <w:t xml:space="preserve">Target</w:t>
-            </w:r>
-          </w:p>
-        </w:tc>
-        <w:tc>
-          <w:tcPr>
-            <w:tcBorders>
-              <w:top w:val="single" w:sz="1" w:space="0" w:color="000000"/>
-              <w:bottom w:val="single" w:sz="1" w:space="0" w:color="000000"/>
-              <w:left w:val="single" w:sz="1" w:space="0" w:color="000000"/>
-              <w:right w:val="single" w:sz="1" w:space="0" w:color="000000"/>
-            </w:tcBorders>
-          </w:tcPr>
-          <w:p>
-            <w:pPr>
-              <w:spacing w:lineRule="auto"/>
-            </w:pPr>
-            <w:r>
-              <w:rPr/>
-              <w:t xml:space="preserve">Owner</w:t>
-            </w:r>
-          </w:p>
-        </w:tc>
-      </w:tr>
-      <w:tr>
-        <w:trPr>
-          <w:cantSplit/>
-        </w:trPr>
-        <w:tc>
-          <w:tcPr>
-            <w:tcBorders>
-              <w:top w:val="single" w:sz="1" w:space="0" w:color="000000"/>
-              <w:bottom w:val="single" w:sz="1" w:space="0" w:color="000000"/>
-              <w:left w:val="single" w:sz="1" w:space="0" w:color="000000"/>
-              <w:right w:val="single" w:sz="1" w:space="0" w:color="000000"/>
-            </w:tcBorders>
-          </w:tcPr>
-          <w:p>
-            <w:pPr>
-              <w:spacing w:lineRule="auto"/>
-            </w:pPr>
-            <w:r>
-              <w:rPr/>
-              <w:t xml:space="preserve">M1</w:t>
-            </w:r>
-          </w:p>
-        </w:tc>
-        <w:tc>
-          <w:tcPr>
-            <w:tcBorders>
-              <w:top w:val="single" w:sz="1" w:space="0" w:color="000000"/>
-              <w:bottom w:val="single" w:sz="1" w:space="0" w:color="000000"/>
-              <w:left w:val="single" w:sz="1" w:space="0" w:color="000000"/>
-              <w:right w:val="single" w:sz="1" w:space="0" w:color="000000"/>
-            </w:tcBorders>
-          </w:tcPr>
-          <w:p>
-            <w:pPr>
-              <w:spacing w:lineRule="auto"/>
-            </w:pPr>
-            <w:r>
-              <w:rPr/>
-              <w:t xml:space="preserve">BRD approved</w:t>
-            </w:r>
-          </w:p>
-        </w:tc>
-        <w:tc>
-          <w:tcPr>
-            <w:tcBorders>
-              <w:top w:val="single" w:sz="1" w:space="0" w:color="000000"/>
-              <w:bottom w:val="single" w:sz="1" w:space="0" w:color="000000"/>
-              <w:left w:val="single" w:sz="1" w:space="0" w:color="000000"/>
-              <w:right w:val="single" w:sz="1" w:space="0" w:color="000000"/>
-            </w:tcBorders>
-          </w:tcPr>
-          <w:p>
-            <w:pPr>
-              <w:spacing w:lineRule="auto"/>
-            </w:pPr>
-            <w:r>
-              <w:rPr/>
-              <w:t xml:space="preserve">End of Week 4</w:t>
-            </w:r>
-          </w:p>
-        </w:tc>
-        <w:tc>
-          <w:tcPr>
-            <w:tcBorders>
-              <w:top w:val="single" w:sz="1" w:space="0" w:color="000000"/>
-              <w:bottom w:val="single" w:sz="1" w:space="0" w:color="000000"/>
-              <w:left w:val="single" w:sz="1" w:space="0" w:color="000000"/>
-              <w:right w:val="single" w:sz="1" w:space="0" w:color="000000"/>
-            </w:tcBorders>
-          </w:tcPr>
-          <w:p>
-            <w:pPr>
-              <w:spacing w:lineRule="auto"/>
-            </w:pPr>
-            <w:r>
-              <w:rPr/>
-              <w:t xml:space="preserve">Sponsor</w:t>
-            </w:r>
-          </w:p>
-        </w:tc>
-      </w:tr>
-      <w:tr>
-        <w:trPr>
-          <w:cantSplit/>
-        </w:trPr>
-        <w:tc>
-          <w:tcPr>
-            <w:tcBorders>
-              <w:top w:val="single" w:sz="1" w:space="0" w:color="000000"/>
-              <w:bottom w:val="single" w:sz="1" w:space="0" w:color="000000"/>
-              <w:left w:val="single" w:sz="1" w:space="0" w:color="000000"/>
-              <w:right w:val="single" w:sz="1" w:space="0" w:color="000000"/>
-            </w:tcBorders>
-          </w:tcPr>
-          <w:p>
-            <w:pPr>
-              <w:spacing w:lineRule="auto"/>
-            </w:pPr>
-            <w:r>
-              <w:rPr/>
-              <w:t xml:space="preserve">M2</w:t>
-            </w:r>
-          </w:p>
-        </w:tc>
-        <w:tc>
-          <w:tcPr>
-            <w:tcBorders>
-              <w:top w:val="single" w:sz="1" w:space="0" w:color="000000"/>
-              <w:bottom w:val="single" w:sz="1" w:space="0" w:color="000000"/>
-              <w:left w:val="single" w:sz="1" w:space="0" w:color="000000"/>
-              <w:right w:val="single" w:sz="1" w:space="0" w:color="000000"/>
-            </w:tcBorders>
-          </w:tcPr>
-          <w:p>
-            <w:pPr>
-              <w:spacing w:lineRule="auto"/>
-            </w:pPr>
-            <w:r>
-              <w:rPr/>
-              <w:t xml:space="preserve">Solution design signed off</w:t>
-            </w:r>
-          </w:p>
-        </w:tc>
-        <w:tc>
-          <w:tcPr>
-            <w:tcBorders>
-              <w:top w:val="single" w:sz="1" w:space="0" w:color="000000"/>
-              <w:bottom w:val="single" w:sz="1" w:space="0" w:color="000000"/>
-              <w:left w:val="single" w:sz="1" w:space="0" w:color="000000"/>
-              <w:right w:val="single" w:sz="1" w:space="0" w:color="000000"/>
-            </w:tcBorders>
-          </w:tcPr>
-          <w:p>
-            <w:pPr>
-              <w:spacing w:lineRule="auto"/>
-            </w:pPr>
-            <w:r>
-              <w:rPr/>
-              <w:t xml:space="preserve">End of Week 10</w:t>
-            </w:r>
-          </w:p>
-        </w:tc>
-        <w:tc>
-          <w:tcPr>
-            <w:tcBorders>
-              <w:top w:val="single" w:sz="1" w:space="0" w:color="000000"/>
-              <w:bottom w:val="single" w:sz="1" w:space="0" w:color="000000"/>
-              <w:left w:val="single" w:sz="1" w:space="0" w:color="000000"/>
-              <w:right w:val="single" w:sz="1" w:space="0" w:color="000000"/>
-            </w:tcBorders>
-          </w:tcPr>
-          <w:p>
-            <w:pPr>
-              <w:spacing w:lineRule="auto"/>
-            </w:pPr>
-            <w:r>
-              <w:rPr/>
-              <w:t xml:space="preserve">BA + IT</w:t>
-            </w:r>
-          </w:p>
-        </w:tc>
-      </w:tr>
-      <w:tr>
-        <w:trPr>
-          <w:cantSplit/>
-        </w:trPr>
-        <w:tc>
-          <w:tcPr>
-            <w:tcBorders>
-              <w:top w:val="single" w:sz="1" w:space="0" w:color="000000"/>
-              <w:bottom w:val="single" w:sz="1" w:space="0" w:color="000000"/>
-              <w:left w:val="single" w:sz="1" w:space="0" w:color="000000"/>
-              <w:right w:val="single" w:sz="1" w:space="0" w:color="000000"/>
-            </w:tcBorders>
-          </w:tcPr>
-          <w:p>
-            <w:pPr>
-              <w:spacing w:lineRule="auto"/>
-            </w:pPr>
-            <w:r>
-              <w:rPr/>
-              <w:t xml:space="preserve">M3</w:t>
-            </w:r>
-          </w:p>
-        </w:tc>
-        <w:tc>
-          <w:tcPr>
-            <w:tcBorders>
-              <w:top w:val="single" w:sz="1" w:space="0" w:color="000000"/>
-              <w:bottom w:val="single" w:sz="1" w:space="0" w:color="000000"/>
-              <w:left w:val="single" w:sz="1" w:space="0" w:color="000000"/>
-              <w:right w:val="single" w:sz="1" w:space="0" w:color="000000"/>
-            </w:tcBorders>
-          </w:tcPr>
-          <w:p>
-            <w:pPr>
-              <w:spacing w:lineRule="auto"/>
-            </w:pPr>
-            <w:r>
-              <w:rPr/>
-              <w:t xml:space="preserve">Build complete</w:t>
-            </w:r>
-          </w:p>
-        </w:tc>
-        <w:tc>
-          <w:tcPr>
-            <w:tcBorders>
-              <w:top w:val="single" w:sz="1" w:space="0" w:color="000000"/>
-              <w:bottom w:val="single" w:sz="1" w:space="0" w:color="000000"/>
-              <w:left w:val="single" w:sz="1" w:space="0" w:color="000000"/>
-              <w:right w:val="single" w:sz="1" w:space="0" w:color="000000"/>
-            </w:tcBorders>
-          </w:tcPr>
-          <w:p>
-            <w:pPr>
-              <w:spacing w:lineRule="auto"/>
-            </w:pPr>
-            <w:r>
-              <w:rPr/>
-              <w:t xml:space="preserve">End of Week 25</w:t>
-            </w:r>
-          </w:p>
-        </w:tc>
-        <w:tc>
-          <w:tcPr>
-            <w:tcBorders>
-              <w:top w:val="single" w:sz="1" w:space="0" w:color="000000"/>
-              <w:bottom w:val="single" w:sz="1" w:space="0" w:color="000000"/>
-              <w:left w:val="single" w:sz="1" w:space="0" w:color="000000"/>
-              <w:right w:val="single" w:sz="1" w:space="0" w:color="000000"/>
-            </w:tcBorders>
-          </w:tcPr>
-          <w:p>
-            <w:pPr>
-              <w:spacing w:lineRule="auto"/>
-            </w:pPr>
-            <w:r>
-              <w:rPr/>
-              <w:t xml:space="preserve">Delivery Lead</w:t>
-            </w:r>
-          </w:p>
-        </w:tc>
-      </w:tr>
-      <w:tr>
-        <w:trPr>
-          <w:cantSplit/>
-        </w:trPr>
-        <w:tc>
-          <w:tcPr>
-            <w:tcBorders>
-              <w:top w:val="single" w:sz="1" w:space="0" w:color="000000"/>
-              <w:bottom w:val="single" w:sz="1" w:space="0" w:color="000000"/>
-              <w:left w:val="single" w:sz="1" w:space="0" w:color="000000"/>
-              <w:right w:val="single" w:sz="1" w:space="0" w:color="000000"/>
-            </w:tcBorders>
-          </w:tcPr>
-          <w:p>
-            <w:pPr>
-              <w:spacing w:lineRule="auto"/>
-            </w:pPr>
-            <w:r>
-              <w:rPr/>
-              <w:t xml:space="preserve">M4</w:t>
-            </w:r>
-          </w:p>
-        </w:tc>
-        <w:tc>
-          <w:tcPr>
-            <w:tcBorders>
-              <w:top w:val="single" w:sz="1" w:space="0" w:color="000000"/>
-              <w:bottom w:val="single" w:sz="1" w:space="0" w:color="000000"/>
-              <w:left w:val="single" w:sz="1" w:space="0" w:color="000000"/>
-              <w:right w:val="single" w:sz="1" w:space="0" w:color="000000"/>
-            </w:tcBorders>
-          </w:tcPr>
-          <w:p>
-            <w:pPr>
-              <w:spacing w:lineRule="auto"/>
-            </w:pPr>
-            <w:r>
-              <w:rPr/>
-              <w:t xml:space="preserve">UAT sign-off</w:t>
-            </w:r>
-          </w:p>
-        </w:tc>
-        <w:tc>
-          <w:tcPr>
-            <w:tcBorders>
-              <w:top w:val="single" w:sz="1" w:space="0" w:color="000000"/>
-              <w:bottom w:val="single" w:sz="1" w:space="0" w:color="000000"/>
-              <w:left w:val="single" w:sz="1" w:space="0" w:color="000000"/>
-              <w:right w:val="single" w:sz="1" w:space="0" w:color="000000"/>
-            </w:tcBorders>
-          </w:tcPr>
-          <w:p>
-            <w:pPr>
-              <w:spacing w:lineRule="auto"/>
-            </w:pPr>
-            <w:r>
-              <w:rPr/>
-              <w:t xml:space="preserve">End of Week 31</w:t>
-            </w:r>
-          </w:p>
-        </w:tc>
-        <w:tc>
-          <w:tcPr>
-            <w:tcBorders>
-              <w:top w:val="single" w:sz="1" w:space="0" w:color="000000"/>
-              <w:bottom w:val="single" w:sz="1" w:space="0" w:color="000000"/>
-              <w:left w:val="single" w:sz="1" w:space="0" w:color="000000"/>
-              <w:right w:val="single" w:sz="1" w:space="0" w:color="000000"/>
-            </w:tcBorders>
-          </w:tcPr>
-          <w:p>
-            <w:pPr>
-              <w:spacing w:lineRule="auto"/>
-            </w:pPr>
-            <w:r>
-              <w:rPr/>
-              <w:t xml:space="preserve">Business Owners</w:t>
-            </w:r>
-          </w:p>
-        </w:tc>
-      </w:tr>
-      <w:tr>
-        <w:trPr>
-          <w:cantSplit/>
-        </w:trPr>
-        <w:tc>
-          <w:tcPr>
-            <w:tcBorders>
-              <w:top w:val="single" w:sz="1" w:space="0" w:color="000000"/>
-              <w:bottom w:val="single" w:sz="1" w:space="0" w:color="000000"/>
-              <w:left w:val="single" w:sz="1" w:space="0" w:color="000000"/>
-              <w:right w:val="single" w:sz="1" w:space="0" w:color="000000"/>
-            </w:tcBorders>
-          </w:tcPr>
-          <w:p>
-            <w:pPr>
-              <w:spacing w:lineRule="auto"/>
-            </w:pPr>
-            <w:r>
-              <w:rPr/>
-              <w:t xml:space="preserve">M5</w:t>
-            </w:r>
-          </w:p>
-        </w:tc>
-        <w:tc>
-          <w:tcPr>
-            <w:tcBorders>
-              <w:top w:val="single" w:sz="1" w:space="0" w:color="000000"/>
-              <w:bottom w:val="single" w:sz="1" w:space="0" w:color="000000"/>
-              <w:left w:val="single" w:sz="1" w:space="0" w:color="000000"/>
-              <w:right w:val="single" w:sz="1" w:space="0" w:color="000000"/>
-            </w:tcBorders>
-          </w:tcPr>
-          <w:p>
-            <w:pPr>
-              <w:spacing w:lineRule="auto"/>
-            </w:pPr>
-            <w:r>
-              <w:rPr/>
-              <w:t xml:space="preserve">Pilot go-live</w:t>
-            </w:r>
-          </w:p>
-        </w:tc>
-        <w:tc>
-          <w:tcPr>
-            <w:tcBorders>
-              <w:top w:val="single" w:sz="1" w:space="0" w:color="000000"/>
-              <w:bottom w:val="single" w:sz="1" w:space="0" w:color="000000"/>
-              <w:left w:val="single" w:sz="1" w:space="0" w:color="000000"/>
-              <w:right w:val="single" w:sz="1" w:space="0" w:color="000000"/>
-            </w:tcBorders>
-          </w:tcPr>
-          <w:p>
-            <w:pPr>
-              <w:spacing w:lineRule="auto"/>
-            </w:pPr>
-            <w:r>
-              <w:rPr/>
-              <w:t xml:space="preserve">Week 34</w:t>
-            </w:r>
-          </w:p>
-        </w:tc>
-        <w:tc>
-          <w:tcPr>
-            <w:tcBorders>
-              <w:top w:val="single" w:sz="1" w:space="0" w:color="000000"/>
-              <w:bottom w:val="single" w:sz="1" w:space="0" w:color="000000"/>
-              <w:left w:val="single" w:sz="1" w:space="0" w:color="000000"/>
-              <w:right w:val="single" w:sz="1" w:space="0" w:color="000000"/>
-            </w:tcBorders>
-          </w:tcPr>
-          <w:p>
-            <w:pPr>
-              <w:spacing w:lineRule="auto"/>
-            </w:pPr>
-            <w:r>
-              <w:rPr/>
-              <w:t xml:space="preserve">Programme Manager</w:t>
-            </w:r>
-          </w:p>
-        </w:tc>
-      </w:tr>
-      <w:tr>
-        <w:trPr>
-          <w:cantSplit/>
-        </w:trPr>
-        <w:tc>
-          <w:tcPr>
-            <w:tcBorders>
-              <w:top w:val="single" w:sz="1" w:space="0" w:color="000000"/>
-              <w:bottom w:val="single" w:sz="1" w:space="0" w:color="000000"/>
-              <w:left w:val="single" w:sz="1" w:space="0" w:color="000000"/>
-              <w:right w:val="single" w:sz="1" w:space="0" w:color="000000"/>
-            </w:tcBorders>
-          </w:tcPr>
-          <w:p>
-            <w:pPr>
-              <w:spacing w:lineRule="auto"/>
-            </w:pPr>
-            <w:r>
-              <w:rPr/>
-              <w:t xml:space="preserve">M6</w:t>
-            </w:r>
-          </w:p>
-        </w:tc>
-        <w:tc>
-          <w:tcPr>
-            <w:tcBorders>
-              <w:top w:val="single" w:sz="1" w:space="0" w:color="000000"/>
-              <w:bottom w:val="single" w:sz="1" w:space="0" w:color="000000"/>
-              <w:left w:val="single" w:sz="1" w:space="0" w:color="000000"/>
-              <w:right w:val="single" w:sz="1" w:space="0" w:color="000000"/>
-            </w:tcBorders>
-          </w:tcPr>
-          <w:p>
-            <w:pPr>
-              <w:spacing w:lineRule="auto"/>
-            </w:pPr>
-            <w:r>
-              <w:rPr/>
-              <w:t xml:space="preserve">Full rollout complete</w:t>
-            </w:r>
-          </w:p>
-        </w:tc>
-        <w:tc>
-          <w:tcPr>
-            <w:tcBorders>
-              <w:top w:val="single" w:sz="1" w:space="0" w:color="000000"/>
-              <w:bottom w:val="single" w:sz="1" w:space="0" w:color="000000"/>
-              <w:left w:val="single" w:sz="1" w:space="0" w:color="000000"/>
-              <w:right w:val="single" w:sz="1" w:space="0" w:color="000000"/>
-            </w:tcBorders>
-          </w:tcPr>
-          <w:p>
-            <w:pPr>
-              <w:spacing w:lineRule="auto"/>
-            </w:pPr>
-            <w:r>
-              <w:rPr/>
-              <w:t xml:space="preserve">End of Week 40</w:t>
-            </w:r>
-          </w:p>
-        </w:tc>
-        <w:tc>
-          <w:tcPr>
-            <w:tcBorders>
-              <w:top w:val="single" w:sz="1" w:space="0" w:color="000000"/>
-              <w:bottom w:val="single" w:sz="1" w:space="0" w:color="000000"/>
-              <w:left w:val="single" w:sz="1" w:space="0" w:color="000000"/>
-              <w:right w:val="single" w:sz="1" w:space="0" w:color="000000"/>
-            </w:tcBorders>
-          </w:tcPr>
-          <w:p>
-            <w:pPr>
-              <w:spacing w:lineRule="auto"/>
-            </w:pPr>
-            <w:r>
-              <w:rPr/>
-              <w:t xml:space="preserve">Programme Manager</w:t>
-            </w:r>
-          </w:p>
-        </w:tc>
-      </w:tr>
-      <w:tr>
-        <w:trPr>
-          <w:cantSplit/>
-        </w:trPr>
-        <w:tc>
-          <w:tcPr>
-            <w:tcBorders>
-              <w:top w:val="single" w:sz="1" w:space="0" w:color="000000"/>
-              <w:bottom w:val="single" w:sz="1" w:space="0" w:color="000000"/>
-              <w:left w:val="single" w:sz="1" w:space="0" w:color="000000"/>
-              <w:right w:val="single" w:sz="1" w:space="0" w:color="000000"/>
-            </w:tcBorders>
-          </w:tcPr>
-          <w:p>
-            <w:pPr>
-              <w:spacing w:lineRule="auto"/>
-            </w:pPr>
-            <w:r>
-              <w:rPr/>
-              <w:t xml:space="preserve">M7</w:t>
-            </w:r>
-          </w:p>
-        </w:tc>
-        <w:tc>
-          <w:tcPr>
-            <w:tcBorders>
-              <w:top w:val="single" w:sz="1" w:space="0" w:color="000000"/>
-              <w:bottom w:val="single" w:sz="1" w:space="0" w:color="000000"/>
-              <w:left w:val="single" w:sz="1" w:space="0" w:color="000000"/>
-              <w:right w:val="single" w:sz="1" w:space="0" w:color="000000"/>
-            </w:tcBorders>
-          </w:tcPr>
-          <w:p>
-            <w:pPr>
-              <w:spacing w:lineRule="auto"/>
-            </w:pPr>
-            <w:r>
-              <w:rPr/>
-              <w:t xml:space="preserve">Phase 1 closure &amp; benefits review</w:t>
-            </w:r>
-          </w:p>
-        </w:tc>
-        <w:tc>
-          <w:tcPr>
-            <w:tcBorders>
-              <w:top w:val="single" w:sz="1" w:space="0" w:color="000000"/>
-              <w:bottom w:val="single" w:sz="1" w:space="0" w:color="000000"/>
-              <w:left w:val="single" w:sz="1" w:space="0" w:color="000000"/>
-              <w:right w:val="single" w:sz="1" w:space="0" w:color="000000"/>
-            </w:tcBorders>
-          </w:tcPr>
-          <w:p>
-            <w:pPr>
-              <w:spacing w:lineRule="auto"/>
-            </w:pPr>
-            <w:r>
-              <w:rPr/>
-              <w:t xml:space="preserve">End of Week 48</w:t>
-            </w:r>
-          </w:p>
-        </w:tc>
-        <w:tc>
-          <w:tcPr>
-            <w:tcBorders>
-              <w:top w:val="single" w:sz="1" w:space="0" w:color="000000"/>
-              <w:bottom w:val="single" w:sz="1" w:space="0" w:color="000000"/>
-              <w:left w:val="single" w:sz="1" w:space="0" w:color="000000"/>
-              <w:right w:val="single" w:sz="1" w:space="0" w:color="000000"/>
-            </w:tcBorders>
-          </w:tcPr>
-          <w:p>
-            <w:pPr>
-              <w:spacing w:lineRule="auto"/>
-            </w:pPr>
-            <w:r>
-              <w:rPr/>
-              <w:t xml:space="preserve">Sponsor</w:t>
-            </w:r>
-          </w:p>
-        </w:tc>
-      </w:tr>
-    </w:tbl>
-    <w:p>
-      <w:pPr>
-        <w:spacing w:lineRule="auto"/>
-      </w:pPr>
-      <w:r>
-        <w:rPr/>
-      </w:r>
-    </w:p>
-    <w:p>
-      <w:pPr>
-        <w:pStyle w:val="Heading2"/>
-        <w:spacing w:lineRule="auto"/>
-      </w:pPr>
-      <w:r>
-        <w:rPr/>
-        <w:t xml:space="preserve">15. Approval &amp; Sign-Off</w:t>
-      </w:r>
-    </w:p>
-    <w:tbl>
-      <w:tblPr>
-        <w:tblBorders>
-          <w:top w:val="single" w:sz="2" w:space="0" w:color="000000"/>
-          <w:bottom w:val="single" w:sz="2" w:space="0" w:color="000000"/>
-          <w:left w:val="single" w:sz="2" w:space="0" w:color="000000"/>
-          <w:right w:val="single" w:sz="2" w:space="0" w:color="000000"/>
-        </w:tblBorders>
-        <w:tblCellSpacing w:w="0" w:type="dxa"/>
-        <w:tblCellMar>
-          <w:top w:type="dxa" w:w="80"/>
-          <w:bottom w:type="dxa" w:w="80"/>
-          <w:left w:type="dxa" w:w="160"/>
-          <w:right w:type="dxa" w:w="160"/>
-        </w:tblCellMar>
-        <w:jc w:val="center"/>
-      </w:tblPr>
-      <w:tblGrid>
-        <w:gridCol w:w="2048"/>
-        <w:gridCol w:w="2048"/>
-        <w:gridCol w:w="2048"/>
-        <w:gridCol w:w="2048"/>
-        <w:gridCol w:w="2048"/>
-      </w:tblGrid>
-      <w:tr>
-        <w:trPr>
-          <w:cantSplit/>
-        </w:trPr>
-        <w:tc>
-          <w:tcPr>
-            <w:tcBorders>
-              <w:top w:val="single" w:sz="1" w:space="0" w:color="000000"/>
-              <w:bottom w:val="single" w:sz="1" w:space="0" w:color="000000"/>
-              <w:left w:val="single" w:sz="1" w:space="0" w:color="000000"/>
-              <w:right w:val="single" w:sz="1" w:space="0" w:color="000000"/>
-            </w:tcBorders>
-          </w:tcPr>
-          <w:p>
-            <w:pPr>
-              <w:spacing w:lineRule="auto"/>
-            </w:pPr>
-            <w:r>
-              <w:rPr/>
-              <w:t xml:space="preserve">Name</w:t>
-            </w:r>
-          </w:p>
-        </w:tc>
-        <w:tc>
-          <w:tcPr>
-            <w:tcBorders>
-              <w:top w:val="single" w:sz="1" w:space="0" w:color="000000"/>
-              <w:bottom w:val="single" w:sz="1" w:space="0" w:color="000000"/>
-              <w:left w:val="single" w:sz="1" w:space="0" w:color="000000"/>
-              <w:right w:val="single" w:sz="1" w:space="0" w:color="000000"/>
-            </w:tcBorders>
-          </w:tcPr>
-          <w:p>
-            <w:pPr>
-              <w:spacing w:lineRule="auto"/>
-            </w:pPr>
-            <w:r>
-              <w:rPr/>
-              <w:t xml:space="preserve">Role</w:t>
-            </w:r>
-          </w:p>
-        </w:tc>
-        <w:tc>
-          <w:tcPr>
-            <w:tcBorders>
-              <w:top w:val="single" w:sz="1" w:space="0" w:color="000000"/>
-              <w:bottom w:val="single" w:sz="1" w:space="0" w:color="000000"/>
-              <w:left w:val="single" w:sz="1" w:space="0" w:color="000000"/>
-              <w:right w:val="single" w:sz="1" w:space="0" w:color="000000"/>
-            </w:tcBorders>
-          </w:tcPr>
-          <w:p>
-            <w:pPr>
-              <w:spacing w:lineRule="auto"/>
-            </w:pPr>
-            <w:r>
-              <w:rPr/>
-              <w:t xml:space="preserve">Decision</w:t>
-            </w:r>
-          </w:p>
-        </w:tc>
-        <w:tc>
-          <w:tcPr>
-            <w:tcBorders>
-              <w:top w:val="single" w:sz="1" w:space="0" w:color="000000"/>
-              <w:bottom w:val="single" w:sz="1" w:space="0" w:color="000000"/>
-              <w:left w:val="single" w:sz="1" w:space="0" w:color="000000"/>
-              <w:right w:val="single" w:sz="1" w:space="0" w:color="000000"/>
-            </w:tcBorders>
-          </w:tcPr>
-          <w:p>
-            <w:pPr>
-              <w:spacing w:lineRule="auto"/>
-            </w:pPr>
-            <w:r>
-              <w:rPr/>
-              <w:t xml:space="preserve">Date</w:t>
-            </w:r>
-          </w:p>
-        </w:tc>
-        <w:tc>
-          <w:tcPr>
-            <w:tcBorders>
-              <w:top w:val="single" w:sz="1" w:space="0" w:color="000000"/>
-              <w:bottom w:val="single" w:sz="1" w:space="0" w:color="000000"/>
-              <w:left w:val="single" w:sz="1" w:space="0" w:color="000000"/>
-              <w:right w:val="single" w:sz="1" w:space="0" w:color="000000"/>
-            </w:tcBorders>
-          </w:tcPr>
-          <w:p>
-            <w:pPr>
-              <w:spacing w:lineRule="auto"/>
-            </w:pPr>
-            <w:r>
-              <w:rPr/>
-              <w:t xml:space="preserve">Signature</w:t>
-            </w:r>
-          </w:p>
-        </w:tc>
-      </w:tr>
-      <w:tr>
-        <w:trPr>
-          <w:cantSplit/>
-        </w:trPr>
-        <w:tc>
-          <w:tcPr>
-            <w:tcBorders>
-              <w:top w:val="single" w:sz="1" w:space="0" w:color="000000"/>
-              <w:bottom w:val="single" w:sz="1" w:space="0" w:color="000000"/>
-              <w:left w:val="single" w:sz="1" w:space="0" w:color="000000"/>
-              <w:right w:val="single" w:sz="1" w:space="0" w:color="000000"/>
-            </w:tcBorders>
-          </w:tcPr>
-          <w:p>
-            <w:pPr>
-              <w:spacing w:lineRule="auto"/>
-            </w:pPr>
-            <w:r>
-              <w:rPr/>
-              <w:t xml:space="preserve"> </w:t>
-            </w:r>
-          </w:p>
-        </w:tc>
-        <w:tc>
-          <w:tcPr>
-            <w:tcBorders>
-              <w:top w:val="single" w:sz="1" w:space="0" w:color="000000"/>
-              <w:bottom w:val="single" w:sz="1" w:space="0" w:color="000000"/>
-              <w:left w:val="single" w:sz="1" w:space="0" w:color="000000"/>
-              <w:right w:val="single" w:sz="1" w:space="0" w:color="000000"/>
-            </w:tcBorders>
-          </w:tcPr>
-          <w:p>
-            <w:pPr>
-              <w:spacing w:lineRule="auto"/>
-            </w:pPr>
-            <w:r>
-              <w:rPr/>
-              <w:t xml:space="preserve">Executive Sponsor (CEO/COO)</w:t>
-            </w:r>
-          </w:p>
-        </w:tc>
-        <w:tc>
-          <w:tcPr>
-            <w:tcBorders>
-              <w:top w:val="single" w:sz="1" w:space="0" w:color="000000"/>
-              <w:bottom w:val="single" w:sz="1" w:space="0" w:color="000000"/>
-              <w:left w:val="single" w:sz="1" w:space="0" w:color="000000"/>
-              <w:right w:val="single" w:sz="1" w:space="0" w:color="000000"/>
-            </w:tcBorders>
-          </w:tcPr>
-          <w:p>
-            <w:pPr>
-              <w:spacing w:lineRule="auto"/>
-            </w:pPr>
-            <w:r>
-              <w:rPr/>
-              <w:t xml:space="preserve">☐ Approve  ☐ Reject  ☐ Approve with comment</w:t>
-            </w:r>
-          </w:p>
-        </w:tc>
-        <w:tc>
-          <w:tcPr>
-            <w:tcBorders>
-              <w:top w:val="single" w:sz="1" w:space="0" w:color="000000"/>
-              <w:bottom w:val="single" w:sz="1" w:space="0" w:color="000000"/>
-              <w:left w:val="single" w:sz="1" w:space="0" w:color="000000"/>
-              <w:right w:val="single" w:sz="1" w:space="0" w:color="000000"/>
-            </w:tcBorders>
-          </w:tcPr>
-          <w:p>
-            <w:pPr>
-              <w:spacing w:lineRule="auto"/>
-            </w:pPr>
-            <w:r>
-              <w:rPr/>
-              <w:t xml:space="preserve"> </w:t>
-            </w:r>
-          </w:p>
-        </w:tc>
-        <w:tc>
-          <w:tcPr>
-            <w:tcBorders>
-              <w:top w:val="single" w:sz="1" w:space="0" w:color="000000"/>
-              <w:bottom w:val="single" w:sz="1" w:space="0" w:color="000000"/>
-              <w:left w:val="single" w:sz="1" w:space="0" w:color="000000"/>
-              <w:right w:val="single" w:sz="1" w:space="0" w:color="000000"/>
-            </w:tcBorders>
-          </w:tcPr>
-          <w:p>
-            <w:pPr>
-              <w:spacing w:lineRule="auto"/>
-            </w:pPr>
-            <w:r>
-              <w:rPr/>
-              <w:t xml:space="preserve"> </w:t>
-            </w:r>
-          </w:p>
-        </w:tc>
-      </w:tr>
-      <w:tr>
-        <w:trPr>
-          <w:cantSplit/>
-        </w:trPr>
-        <w:tc>
-          <w:tcPr>
-            <w:tcBorders>
-              <w:top w:val="single" w:sz="1" w:space="0" w:color="000000"/>
-              <w:bottom w:val="single" w:sz="1" w:space="0" w:color="000000"/>
-              <w:left w:val="single" w:sz="1" w:space="0" w:color="000000"/>
-              <w:right w:val="single" w:sz="1" w:space="0" w:color="000000"/>
-            </w:tcBorders>
-          </w:tcPr>
-          <w:p>
-            <w:pPr>
-              <w:spacing w:lineRule="auto"/>
-            </w:pPr>
-            <w:r>
-              <w:rPr/>
-              <w:t xml:space="preserve"> </w:t>
-            </w:r>
-          </w:p>
-        </w:tc>
-        <w:tc>
-          <w:tcPr>
-            <w:tcBorders>
-              <w:top w:val="single" w:sz="1" w:space="0" w:color="000000"/>
-              <w:bottom w:val="single" w:sz="1" w:space="0" w:color="000000"/>
-              <w:left w:val="single" w:sz="1" w:space="0" w:color="000000"/>
-              <w:right w:val="single" w:sz="1" w:space="0" w:color="000000"/>
-            </w:tcBorders>
-          </w:tcPr>
-          <w:p>
-            <w:pPr>
-              <w:spacing w:lineRule="auto"/>
-            </w:pPr>
-            <w:r>
-              <w:rPr/>
-              <w:t xml:space="preserve">Head of Professional Services</w:t>
-            </w:r>
-          </w:p>
-        </w:tc>
-        <w:tc>
-          <w:tcPr>
-            <w:tcBorders>
-              <w:top w:val="single" w:sz="1" w:space="0" w:color="000000"/>
-              <w:bottom w:val="single" w:sz="1" w:space="0" w:color="000000"/>
-              <w:left w:val="single" w:sz="1" w:space="0" w:color="000000"/>
-              <w:right w:val="single" w:sz="1" w:space="0" w:color="000000"/>
-            </w:tcBorders>
-          </w:tcPr>
-          <w:p>
-            <w:pPr>
-              <w:spacing w:lineRule="auto"/>
-            </w:pPr>
-            <w:r>
-              <w:rPr/>
-              <w:t xml:space="preserve">☐ Approve  ☐ Reject  ☐ Approve with comment</w:t>
-            </w:r>
-          </w:p>
-        </w:tc>
-        <w:tc>
-          <w:tcPr>
-            <w:tcBorders>
-              <w:top w:val="single" w:sz="1" w:space="0" w:color="000000"/>
-              <w:bottom w:val="single" w:sz="1" w:space="0" w:color="000000"/>
-              <w:left w:val="single" w:sz="1" w:space="0" w:color="000000"/>
-              <w:right w:val="single" w:sz="1" w:space="0" w:color="000000"/>
-            </w:tcBorders>
-          </w:tcPr>
-          <w:p>
-            <w:pPr>
-              <w:spacing w:lineRule="auto"/>
-            </w:pPr>
-            <w:r>
-              <w:rPr/>
-              <w:t xml:space="preserve"> </w:t>
-            </w:r>
-          </w:p>
-        </w:tc>
-        <w:tc>
-          <w:tcPr>
-            <w:tcBorders>
-              <w:top w:val="single" w:sz="1" w:space="0" w:color="000000"/>
-              <w:bottom w:val="single" w:sz="1" w:space="0" w:color="000000"/>
-              <w:left w:val="single" w:sz="1" w:space="0" w:color="000000"/>
-              <w:right w:val="single" w:sz="1" w:space="0" w:color="000000"/>
-            </w:tcBorders>
-          </w:tcPr>
-          <w:p>
-            <w:pPr>
-              <w:spacing w:lineRule="auto"/>
-            </w:pPr>
-            <w:r>
-              <w:rPr/>
-              <w:t xml:space="preserve"> </w:t>
-            </w:r>
-          </w:p>
-        </w:tc>
-      </w:tr>
-      <w:tr>
-        <w:trPr>
-          <w:cantSplit/>
-        </w:trPr>
-        <w:tc>
-          <w:tcPr>
-            <w:tcBorders>
-              <w:top w:val="single" w:sz="1" w:space="0" w:color="000000"/>
-              <w:bottom w:val="single" w:sz="1" w:space="0" w:color="000000"/>
-              <w:left w:val="single" w:sz="1" w:space="0" w:color="000000"/>
-              <w:right w:val="single" w:sz="1" w:space="0" w:color="000000"/>
-            </w:tcBorders>
-          </w:tcPr>
-          <w:p>
-            <w:pPr>
-              <w:spacing w:lineRule="auto"/>
-            </w:pPr>
-            <w:r>
-              <w:rPr/>
-              <w:t xml:space="preserve"> </w:t>
-            </w:r>
-          </w:p>
-        </w:tc>
-        <w:tc>
-          <w:tcPr>
-            <w:tcBorders>
-              <w:top w:val="single" w:sz="1" w:space="0" w:color="000000"/>
-              <w:bottom w:val="single" w:sz="1" w:space="0" w:color="000000"/>
-              <w:left w:val="single" w:sz="1" w:space="0" w:color="000000"/>
-              <w:right w:val="single" w:sz="1" w:space="0" w:color="000000"/>
-            </w:tcBorders>
-          </w:tcPr>
-          <w:p>
-            <w:pPr>
-              <w:spacing w:lineRule="auto"/>
-            </w:pPr>
-            <w:r>
-              <w:rPr/>
-              <w:t xml:space="preserve">Chief Financial Officer</w:t>
-            </w:r>
-          </w:p>
-        </w:tc>
-        <w:tc>
-          <w:tcPr>
-            <w:tcBorders>
-              <w:top w:val="single" w:sz="1" w:space="0" w:color="000000"/>
-              <w:bottom w:val="single" w:sz="1" w:space="0" w:color="000000"/>
-              <w:left w:val="single" w:sz="1" w:space="0" w:color="000000"/>
-              <w:right w:val="single" w:sz="1" w:space="0" w:color="000000"/>
-            </w:tcBorders>
-          </w:tcPr>
-          <w:p>
-            <w:pPr>
-              <w:spacing w:lineRule="auto"/>
-            </w:pPr>
-            <w:r>
-              <w:rPr/>
-              <w:t xml:space="preserve">☐ Approve  ☐ Reject  ☐ Approve with comment</w:t>
-            </w:r>
-          </w:p>
-        </w:tc>
-        <w:tc>
-          <w:tcPr>
-            <w:tcBorders>
-              <w:top w:val="single" w:sz="1" w:space="0" w:color="000000"/>
-              <w:bottom w:val="single" w:sz="1" w:space="0" w:color="000000"/>
-              <w:left w:val="single" w:sz="1" w:space="0" w:color="000000"/>
-              <w:right w:val="single" w:sz="1" w:space="0" w:color="000000"/>
-            </w:tcBorders>
-          </w:tcPr>
-          <w:p>
-            <w:pPr>
-              <w:spacing w:lineRule="auto"/>
-            </w:pPr>
-            <w:r>
-              <w:rPr/>
-              <w:t xml:space="preserve"> </w:t>
-            </w:r>
-          </w:p>
-        </w:tc>
-        <w:tc>
-          <w:tcPr>
-            <w:tcBorders>
-              <w:top w:val="single" w:sz="1" w:space="0" w:color="000000"/>
-              <w:bottom w:val="single" w:sz="1" w:space="0" w:color="000000"/>
-              <w:left w:val="single" w:sz="1" w:space="0" w:color="000000"/>
-              <w:right w:val="single" w:sz="1" w:space="0" w:color="000000"/>
-            </w:tcBorders>
-          </w:tcPr>
-          <w:p>
-            <w:pPr>
-              <w:spacing w:lineRule="auto"/>
-            </w:pPr>
-            <w:r>
-              <w:rPr/>
-              <w:t xml:space="preserve"> </w:t>
-            </w:r>
-          </w:p>
-        </w:tc>
-      </w:tr>
-      <w:tr>
-        <w:trPr>
-          <w:cantSplit/>
-        </w:trPr>
-        <w:tc>
-          <w:tcPr>
-            <w:tcBorders>
-              <w:top w:val="single" w:sz="1" w:space="0" w:color="000000"/>
-              <w:bottom w:val="single" w:sz="1" w:space="0" w:color="000000"/>
-              <w:left w:val="single" w:sz="1" w:space="0" w:color="000000"/>
-              <w:right w:val="single" w:sz="1" w:space="0" w:color="000000"/>
-            </w:tcBorders>
-          </w:tcPr>
-          <w:p>
-            <w:pPr>
-              <w:spacing w:lineRule="auto"/>
-            </w:pPr>
-            <w:r>
-              <w:rPr/>
-              <w:t xml:space="preserve"> </w:t>
-            </w:r>
-          </w:p>
-        </w:tc>
-        <w:tc>
-          <w:tcPr>
-            <w:tcBorders>
-              <w:top w:val="single" w:sz="1" w:space="0" w:color="000000"/>
-              <w:bottom w:val="single" w:sz="1" w:space="0" w:color="000000"/>
-              <w:left w:val="single" w:sz="1" w:space="0" w:color="000000"/>
-              <w:right w:val="single" w:sz="1" w:space="0" w:color="000000"/>
-            </w:tcBorders>
-          </w:tcPr>
-          <w:p>
-            <w:pPr>
-              <w:spacing w:lineRule="auto"/>
-            </w:pPr>
-            <w:r>
-              <w:rPr/>
-              <w:t xml:space="preserve">Chief Information Officer</w:t>
-            </w:r>
-          </w:p>
-        </w:tc>
-        <w:tc>
-          <w:tcPr>
-            <w:tcBorders>
-              <w:top w:val="single" w:sz="1" w:space="0" w:color="000000"/>
-              <w:bottom w:val="single" w:sz="1" w:space="0" w:color="000000"/>
-              <w:left w:val="single" w:sz="1" w:space="0" w:color="000000"/>
-              <w:right w:val="single" w:sz="1" w:space="0" w:color="000000"/>
-            </w:tcBorders>
-          </w:tcPr>
-          <w:p>
-            <w:pPr>
-              <w:spacing w:lineRule="auto"/>
-            </w:pPr>
-            <w:r>
-              <w:rPr/>
-              <w:t xml:space="preserve">☐ Approve  ☐ Reject  ☐ Approve with comment</w:t>
-            </w:r>
-          </w:p>
-        </w:tc>
-        <w:tc>
-          <w:tcPr>
-            <w:tcBorders>
-              <w:top w:val="single" w:sz="1" w:space="0" w:color="000000"/>
-              <w:bottom w:val="single" w:sz="1" w:space="0" w:color="000000"/>
-              <w:left w:val="single" w:sz="1" w:space="0" w:color="000000"/>
-              <w:right w:val="single" w:sz="1" w:space="0" w:color="000000"/>
-            </w:tcBorders>
-          </w:tcPr>
-          <w:p>
-            <w:pPr>
-              <w:spacing w:lineRule="auto"/>
-            </w:pPr>
-            <w:r>
-              <w:rPr/>
-              <w:t xml:space="preserve"> </w:t>
-            </w:r>
-          </w:p>
-        </w:tc>
-        <w:tc>
-          <w:tcPr>
-            <w:tcBorders>
-              <w:top w:val="single" w:sz="1" w:space="0" w:color="000000"/>
-              <w:bottom w:val="single" w:sz="1" w:space="0" w:color="000000"/>
-              <w:left w:val="single" w:sz="1" w:space="0" w:color="000000"/>
-              <w:right w:val="single" w:sz="1" w:space="0" w:color="000000"/>
-            </w:tcBorders>
-          </w:tcPr>
-          <w:p>
-            <w:pPr>
-              <w:spacing w:lineRule="auto"/>
-            </w:pPr>
-            <w:r>
-              <w:rPr/>
-              <w:t xml:space="preserve"> </w:t>
-            </w:r>
-          </w:p>
-        </w:tc>
-      </w:tr>
-      <w:tr>
-        <w:trPr>
-          <w:cantSplit/>
-        </w:trPr>
-        <w:tc>
-          <w:tcPr>
-            <w:tcBorders>
-              <w:top w:val="single" w:sz="1" w:space="0" w:color="000000"/>
-              <w:bottom w:val="single" w:sz="1" w:space="0" w:color="000000"/>
-              <w:left w:val="single" w:sz="1" w:space="0" w:color="000000"/>
-              <w:right w:val="single" w:sz="1" w:space="0" w:color="000000"/>
-            </w:tcBorders>
-          </w:tcPr>
-          <w:p>
-            <w:pPr>
-              <w:spacing w:lineRule="auto"/>
-            </w:pPr>
-            <w:r>
-              <w:rPr/>
-              <w:t xml:space="preserve"> </w:t>
-            </w:r>
-          </w:p>
-        </w:tc>
-        <w:tc>
-          <w:tcPr>
-            <w:tcBorders>
-              <w:top w:val="single" w:sz="1" w:space="0" w:color="000000"/>
-              <w:bottom w:val="single" w:sz="1" w:space="0" w:color="000000"/>
-              <w:left w:val="single" w:sz="1" w:space="0" w:color="000000"/>
-              <w:right w:val="single" w:sz="1" w:space="0" w:color="000000"/>
-            </w:tcBorders>
-          </w:tcPr>
-          <w:p>
-            <w:pPr>
-              <w:spacing w:lineRule="auto"/>
-            </w:pPr>
-            <w:r>
-              <w:rPr/>
-              <w:t xml:space="preserve">Head of IT Security</w:t>
-            </w:r>
-          </w:p>
-        </w:tc>
-        <w:tc>
-          <w:tcPr>
-            <w:tcBorders>
-              <w:top w:val="single" w:sz="1" w:space="0" w:color="000000"/>
-              <w:bottom w:val="single" w:sz="1" w:space="0" w:color="000000"/>
-              <w:left w:val="single" w:sz="1" w:space="0" w:color="000000"/>
-              <w:right w:val="single" w:sz="1" w:space="0" w:color="000000"/>
-            </w:tcBorders>
-          </w:tcPr>
-          <w:p>
-            <w:pPr>
-              <w:spacing w:lineRule="auto"/>
-            </w:pPr>
-            <w:r>
-              <w:rPr/>
-              <w:t xml:space="preserve">☐ Approve  ☐ Reject  ☐ Approve with comment</w:t>
-            </w:r>
-          </w:p>
-        </w:tc>
-        <w:tc>
-          <w:tcPr>
-            <w:tcBorders>
-              <w:top w:val="single" w:sz="1" w:space="0" w:color="000000"/>
-              <w:bottom w:val="single" w:sz="1" w:space="0" w:color="000000"/>
-              <w:left w:val="single" w:sz="1" w:space="0" w:color="000000"/>
-              <w:right w:val="single" w:sz="1" w:space="0" w:color="000000"/>
-            </w:tcBorders>
-          </w:tcPr>
-          <w:p>
-            <w:pPr>
-              <w:spacing w:lineRule="auto"/>
-            </w:pPr>
-            <w:r>
-              <w:rPr/>
-              <w:t xml:space="preserve"> </w:t>
-            </w:r>
-          </w:p>
-        </w:tc>
-        <w:tc>
-          <w:tcPr>
-            <w:tcBorders>
-              <w:top w:val="single" w:sz="1" w:space="0" w:color="000000"/>
-              <w:bottom w:val="single" w:sz="1" w:space="0" w:color="000000"/>
-              <w:left w:val="single" w:sz="1" w:space="0" w:color="000000"/>
-              <w:right w:val="single" w:sz="1" w:space="0" w:color="000000"/>
-            </w:tcBorders>
-          </w:tcPr>
-          <w:p>
-            <w:pPr>
-              <w:spacing w:lineRule="auto"/>
-            </w:pPr>
-            <w:r>
-              <w:rPr/>
-              <w:t xml:space="preserve"> </w:t>
             </w:r>
           </w:p>
         </w:tc>

</xml_diff>